<commit_message>
corpus: Panood → Watch Live, Kwento → Photo Notes rename banners
Co-Authored-By: Claude Opus 5.5 <noreply@anthropic.com>
</commit_message>
<xml_diff>
--- a/0011_panood/0011_panood.docx
+++ b/0011_panood/0011_panood.docx
@@ -9,6 +9,105 @@
       </w:pPr>
       <w:r>
         <w:t xml:space="preserve">Iteration 0011 — Panood</w:t>
+      </w:r>
+    </w:p>
+    <w:p>
+      <w:pPr>
+        <w:pStyle w:val="BlockText"/>
+      </w:pPr>
+      <w:r>
+        <w:t xml:space="preserve">🏷</w:t>
+      </w:r>
+      <w:r>
+        <w:t xml:space="preserve"> </w:t>
+      </w:r>
+      <w:r>
+        <w:rPr>
+          <w:b/>
+          <w:bCs/>
+        </w:rPr>
+        <w:t xml:space="preserve">RENAMED 2026-09-29 — on screen this is now</w:t>
+      </w:r>
+      <w:r>
+        <w:rPr>
+          <w:b/>
+          <w:bCs/>
+        </w:rPr>
+        <w:t xml:space="preserve"> </w:t>
+      </w:r>
+      <w:r>
+        <w:rPr>
+          <w:b/>
+          <w:bCs/>
+        </w:rPr>
+        <w:t xml:space="preserve">“Watch Live”</w:t>
+      </w:r>
+      <w:r>
+        <w:rPr>
+          <w:b/>
+          <w:bCs/>
+        </w:rPr>
+        <w:t xml:space="preserve">.</w:t>
+      </w:r>
+      <w:r>
+        <w:t xml:space="preserve"> </w:t>
+      </w:r>
+      <w:r>
+        <w:t xml:space="preserve">Owner answer in DECISION_LOG</w:t>
+      </w:r>
+      <w:r>
+        <w:t xml:space="preserve"> </w:t>
+      </w:r>
+      <w:r>
+        <w:t xml:space="preserve">“OWNER ANSWERS — NINE PENDING DECISIONS”</w:t>
+      </w:r>
+      <w:r>
+        <w:t xml:space="preserve"> </w:t>
+      </w:r>
+      <w:r>
+        <w:t xml:space="preserve">(and</w:t>
+      </w:r>
+      <w:r>
+        <w:t xml:space="preserve"> </w:t>
+      </w:r>
+      <w:r>
+        <w:t xml:space="preserve">“ONLY PAPIC KEEPS A CUSTOM NAME”</w:t>
+      </w:r>
+      <w:r>
+        <w:t xml:space="preserve">).</w:t>
+      </w:r>
+      <w:r>
+        <w:t xml:space="preserve"> </w:t>
+      </w:r>
+      <w:r>
+        <w:t xml:space="preserve">“Panood”</w:t>
+      </w:r>
+      <w:r>
+        <w:t xml:space="preserve"> </w:t>
+      </w:r>
+      <w:r>
+        <w:t xml:space="preserve">below is the historical/internal name: routes, tables, SKU codes and file names keep it; every word a person reads says</w:t>
+      </w:r>
+      <w:r>
+        <w:t xml:space="preserve"> </w:t>
+      </w:r>
+      <w:r>
+        <w:t xml:space="preserve">“Watch Live”</w:t>
+      </w:r>
+      <w:r>
+        <w:t xml:space="preserve">. Guarded in code by</w:t>
+      </w:r>
+      <w:r>
+        <w:t xml:space="preserve"> </w:t>
+      </w:r>
+      <w:r>
+        <w:rPr>
+          <w:rStyle w:val="VerbatimChar"/>
+        </w:rPr>
+        <w:t xml:space="preserve">apps/web/lib/retired-names-stay-off-screen.test.ts</w:t>
+      </w:r>
+      <w:r>
+        <w:t xml:space="preserve">.</w:t>
       </w:r>
     </w:p>
     <w:p>

</xml_diff>